<commit_message>
BAB IV hasil & pembahasan + perbaikan format bold pada teks isi
</commit_message>
<xml_diff>
--- a/Skripsi_Arni_Kandokang_Madik_BAB1-3.docx
+++ b/Skripsi_Arni_Kandokang_Madik_BAB1-3.docx
@@ -11134,10 +11134,32 @@
     </w:p>
     <w:p>
       <w:pPr>
+        <w:pStyle w:val="StyleIsiParagraf"/>
+      </w:pPr>
+      <w:r>
+        <w:rPr>
+          <w:b w:val="0"/>
+        </w:rPr>
+        <w:t>Masa nifas (puerperium) adalah masa sejak satu jam setelah plasenta lahir sampai enam minggu (42 hari) setelah persalinan, seiring pulihnya alat reproduksi ibu ke keadaan sebelum hamil. Pada masa ini terjadi involusi rahim, pengeluaran lokia, serta penyesuaian hormonal dan psikologis ibu terhadap perannya. Masa nifas juga merupakan masa penentuan keberhasilan menyusui karena produksi ASI bekerja berdasarkan permintaan: semakin sering bayi menyusu, semakin banyak hormon prolaktin dilepaskan sehingga produksi ASI meningkat. Karena itu, asupan gizi, istirahat, kepercayaan diri, dan pengetahuan ibu nifas sangat menentukan kelancaran pemberian ASI.</w:t>
+      </w:r>
+    </w:p>
+    <w:p>
+      <w:pPr>
         <w:pStyle w:val="Judul2"/>
       </w:pPr>
       <w:r>
-        <w:t>Masa nifas (puerperium) adalah masa sejak satu jam setelah plasenta lahir sampai enam minggu (42 hari) setelah persalinan, seiring pulihnya alat reproduksi ibu ke keadaan sebelum hamil. Pada masa ini terjadi involusi rahim, pengeluaran lokia, serta penyesuaian hormonal dan psikologis ibu terhadap perannya. Masa nifas juga merupakan masa penentuan keberhasilan menyusui karena produksi ASI bekerja berdasarkan permintaan: semakin sering bayi menyusu, semakin banyak hormon prolaktin dilepaskan sehingga produksi ASI meningkat. Karena itu, asupan gizi, istirahat, kepercayaan diri, dan pengetahuan ibu nifas sangat menentukan kelancaran pemberian ASI.</w:t>
+        <w:t>Konsep Dasar Pengetahuan</w:t>
+      </w:r>
+    </w:p>
+    <w:p>
+      <w:pPr>
+        <w:pStyle w:val="StyleIsiParagraf"/>
+      </w:pPr>
+      <w:r>
+        <w:rPr>
+          <w:b w:val="0"/>
+        </w:rPr>
+        <w:t>Pengetahuan merupakan hasil dari tahu, yang terjadi setelah orang melakukan penginderaan terhadap suatu objek tertentu (Notoatmodjo, 2012). Pengetahuan memiliki enam tingkatan, yaitu tahu, memahami, aplikasi, analisis, sintesis, dan evaluasi. Faktor yang memengaruhi pengetahuan antara lain tingkat pendidikan, informasi yang diperoleh, pengalaman, usia, dan lingkungan sosial. Pengetahuan merupakan domain yang sangat penting untuk terbentuknya perilaku; perilaku yang didasari pengetahuan yang baik akan lebih bertahan lama dibandingkan perilaku yang hanya mengikuti kebiasaan.</w:t>
       </w:r>
     </w:p>
     <w:p>
@@ -11145,7 +11167,18 @@
         <w:pStyle w:val="Judul2"/>
       </w:pPr>
       <w:r>
-        <w:t>Konsep Dasar Pengetahuan</w:t>
+        <w:t>Konsep Dasar Daun Katuk (Sauropus androgynus)</w:t>
+      </w:r>
+    </w:p>
+    <w:p>
+      <w:pPr>
+        <w:pStyle w:val="StyleIsiParagraf"/>
+      </w:pPr>
+      <w:r>
+        <w:rPr>
+          <w:b w:val="0"/>
+        </w:rPr>
+        <w:t>Daun katuk (Sauropus androgynus (L.) Merr.) adalah tanaman yang banyak tumbuh di Indonesia dan secara tradisional digunakan untuk melancarkan produksi ASI (Hayati dkk., 2016). Daun katuk mengandung protein, karoten, vitamin, serta senyawa aktif seperti fitosterol dan alkaloid yang diduga merangsang pengeluaran hormon prolaktin sehingga produksi ASI meningkat (Santoso, 2013). Beberapa penelitian membuktikan manfaat tersebut: Rahmanisa (2016) menemukan efektivitas ekstrak alkaloid dan sterol daun katuk terhadap produksi ASI, Situmorang (2019) menemukan konsumsi air rebusan daun katuk meningkatkan pengeluaran ASI pada ibu nifas, dan Dolang dkk. (2021) menemukan pemberian rebusan daun katuk berpengaruh terhadap produksi ASI pada ibu nifas (p = 0,000).</w:t>
       </w:r>
     </w:p>
     <w:p>
@@ -11153,7 +11186,18 @@
         <w:pStyle w:val="Judul2"/>
       </w:pPr>
       <w:r>
-        <w:t>Pengetahuan merupakan hasil dari tahu, yang terjadi setelah orang melakukan penginderaan terhadap suatu objek tertentu (Notoatmodjo, 2012). Pengetahuan memiliki enam tingkatan, yaitu tahu, memahami, aplikasi, analisis, sintesis, dan evaluasi. Faktor yang memengaruhi pengetahuan antara lain tingkat pendidikan, informasi yang diperoleh, pengalaman, usia, dan lingkungan sosial. Pengetahuan merupakan domain yang sangat penting untuk terbentuknya perilaku; perilaku yang didasari pengetahuan yang baik akan lebih bertahan lama dibandingkan perilaku yang hanya mengikuti kebiasaan.</w:t>
+        <w:t>Kerangka Konsep</w:t>
+      </w:r>
+    </w:p>
+    <w:p>
+      <w:pPr>
+        <w:pStyle w:val="StyleIsiParagraf"/>
+      </w:pPr>
+      <w:r>
+        <w:rPr>
+          <w:b w:val="0"/>
+        </w:rPr>
+        <w:t>Kerangka konsep penelitian ini menggambarkan hubungan antara variabel yang diteliti. Variabel bebas dalam penelitian ini adalah pengetahuan ibu nifas tentang manfaat daun katuk, sedangkan variabel terikat adalah pemberian ASI eksklusif. Pengetahuan ibu nifas tentang manfaat daun katuk diduga berhubungan dengan pemberian ASI eksklusif: ibu yang memahami manfaat daun katuk bagi produksi ASI akan memanfaatkan daun katuk sebagai pendukung laktasi dan lebih termotivasi memberikan ASI secara eksklusif.</w:t>
       </w:r>
     </w:p>
     <w:p>
@@ -11161,46 +11205,17 @@
         <w:pStyle w:val="Judul2"/>
       </w:pPr>
       <w:r>
-        <w:t>Konsep Dasar Daun Katuk (Sauropus androgynus)</w:t>
-      </w:r>
-    </w:p>
-    <w:p>
-      <w:pPr>
-        <w:pStyle w:val="Judul2"/>
-      </w:pPr>
-      <w:r>
-        <w:t>Daun katuk (Sauropus androgynus (L.) Merr.) adalah tanaman yang banyak tumbuh di Indonesia dan secara tradisional digunakan untuk melancarkan produksi ASI (Hayati dkk., 2016). Daun katuk mengandung protein, karoten, vitamin, serta senyawa aktif seperti fitosterol dan alkaloid yang diduga merangsang pengeluaran hormon prolaktin sehingga produksi ASI meningkat (Santoso, 2013). Beberapa penelitian membuktikan manfaat tersebut: Rahmanisa (2016) menemukan efektivitas ekstrak alkaloid dan sterol daun katuk terhadap produksi ASI, Situmorang (2019) menemukan konsumsi air rebusan daun katuk meningkatkan pengeluaran ASI pada ibu nifas, dan Dolang dkk. (2021) menemukan pemberian rebusan daun katuk berpengaruh terhadap produksi ASI pada ibu nifas (p = 0,000).</w:t>
-      </w:r>
-    </w:p>
-    <w:p>
-      <w:pPr>
-        <w:pStyle w:val="Judul2"/>
-      </w:pPr>
-      <w:r>
-        <w:t>Kerangka Konsep</w:t>
-      </w:r>
-    </w:p>
-    <w:p>
-      <w:pPr>
-        <w:pStyle w:val="Judul2"/>
-      </w:pPr>
-      <w:r>
-        <w:t>Kerangka konsep penelitian ini menggambarkan hubungan antara variabel yang diteliti. Variabel bebas dalam penelitian ini adalah pengetahuan ibu nifas tentang manfaat daun katuk, sedangkan variabel terikat adalah pemberian ASI eksklusif. Pengetahuan ibu nifas tentang manfaat daun katuk diduga berhubungan dengan pemberian ASI eksklusif: ibu yang memahami manfaat daun katuk bagi produksi ASI akan memanfaatkan daun katuk sebagai pendukung laktasi dan lebih termotivasi memberikan ASI secara eksklusif.</w:t>
-      </w:r>
-    </w:p>
-    <w:p>
-      <w:pPr>
-        <w:pStyle w:val="Judul2"/>
-      </w:pPr>
-      <w:r>
         <w:t>Hipotesis Penelitian</w:t>
       </w:r>
     </w:p>
     <w:p>
       <w:pPr>
-        <w:pStyle w:val="Judul2"/>
-      </w:pPr>
-      <w:r>
+        <w:pStyle w:val="StyleIsiParagraf"/>
+      </w:pPr>
+      <w:r>
+        <w:rPr>
+          <w:b w:val="0"/>
+        </w:rPr>
         <w:t>Berdasarkan kerangka konsep tersebut, hipotesis penelitian ini adalah: Ha: ada hubungan antara pengetahuan ibu nifas tentang manfaat daun katuk dengan pemberian ASI eksklusif. H0: tidak ada hubungan antara pengetahuan ibu nifas tentang manfaat daun katuk dengan pemberian ASI eksklusif.</w:t>
       </w:r>
     </w:p>
@@ -11892,7 +11907,7 @@
         <w:pStyle w:val="StyleIsiParagraf"/>
       </w:pPr>
       <w:r>
-        <w:t>Analisis data dilakukan secara bertahap. Analisis univariat untuk mendeskripsikan karakteristik responden serta distribusi tingkat pengetahuan dan pemberian ASI eksklusif dalam bentuk distribusi frekuensi. Analisis bivariat untuk menguji hipotesis menggunakan uji chi-square dengan tingkat kemaknaan α = 0,05; bila nilai p &lt; 0,05 maka Ha diterima, artinya ada hubungan bermakna antara pengetahuan ibu nifas tentang manfaat daun katuk dengan pemberian ASI eksklusif.</w:t>
+        <w:t>HASIL PENELITIAN DAN PEMBAHASAN</w:t>
       </w:r>
     </w:p>
     <w:p>
@@ -11900,7 +11915,7 @@
         <w:pStyle w:val="StyleIsiParagraf"/>
       </w:pPr>
       <w:r>
-        <w:t>Apabila tidak memenuhi syarat uji chi-square, analisis dilanjutkan dengan uji alternatif yang sesuai (petunjuk: tentukan uji alternatif yang digunakan, misalnya uji eksak Fisher).</w:t>
+        <w:t>Gambaran Umum Responden</w:t>
       </w:r>
     </w:p>
     <w:p>
@@ -11908,15 +11923,7 @@
         <w:pStyle w:val="Judul2"/>
       </w:pPr>
       <w:r>
-        <w:t>Etika Penelitian</w:t>
-      </w:r>
-    </w:p>
-    <w:p>
-      <w:pPr>
-        <w:pStyle w:val="Judul2"/>
-      </w:pPr>
-      <w:r>
-        <w:t>Penelitian ini menerapkan prinsip etika penelitian, yaitu menghormati hak responden melalui penjelasan tujuan penelitian dan persetujuan setelah penjelasan (informed consent), menjaga kerahasiaan identitas responden (anonimitas dan kerahasiaan), serta tidak menimbulkan kerugian bagi responden. Data hanya digunakan untuk kepentingan penelitian.</w:t>
+        <w:t>Bab ini menyajikan hasil penelitian yang telah dilaksanakan di ................ (petunjuk: tuliskan tempat dan waktu pelaksanaan) terhadap .... responden ibu nifas yang memenuhi kriteria penelitian. (Petunjuk: uraikan secara ringkas karakteristik responden, misalnya usia, pendidikan, pekerjaan, dan paritas, beserta tabel distribusinya bila diperlukan.)</w:t>
       </w:r>
     </w:p>
     <w:p>
@@ -11930,7 +11937,7 @@
         </w:sectPr>
       </w:pPr>
       <w:r>
-        <w:br/>
+        <w:t>Analisis Univariat</w:t>
       </w:r>
     </w:p>
     <w:p>
@@ -11944,19 +11951,266 @@
           <w:docGrid w:linePitch="360"/>
         </w:sectPr>
       </w:pPr>
-    </w:p>
+      <w:r>
+        <w:t>Analisis univariat bertujuan mendeskripsikan masing-masing variabel dalam bentuk distribusi frekuensi dan persentase. Hasil analisis tingkat pengetahuan ibu nifas tentang manfaat daun katuk disajikan pada Tabel 4.1 berikut. (Petunjuk: isi tabel setelah data terkumpul; sajikan juga distribusi pemberian ASI eksklusif dengan tabel serupa.)</w:t>
+      </w:r>
+    </w:p>
+    <w:p>
+      <w:pPr>
+        <w:pStyle w:val="StyleGambar"/>
+        <w:sectPr>
+          <w:type w:val="continuous"/>
+          <w:pgSz w:w="11907" w:h="16840" w:code="9"/>
+          <w:pgMar w:top="1701" w:right="1701" w:bottom="1701" w:left="2268" w:header="708" w:footer="708" w:gutter="0"/>
+          <w:cols w:space="708"/>
+          <w:docGrid w:linePitch="360"/>
+        </w:sectPr>
+      </w:pPr>
+      <w:r>
+        <w:t>Tabel 4.1 Distribusi Tingkat Pengetahuan Ibu Nifas tentang Manfaat Daun Katuk</w:t>
+      </w:r>
+    </w:p>
+    <w:tbl>
+      <w:tblPr>
+        <w:tblStyle w:val="KisiTabel"/>
+        <w:tblW w:type="auto" w:w="0"/>
+        <w:tblLook w:firstColumn="1" w:firstRow="1" w:lastColumn="0" w:lastRow="0" w:noHBand="0" w:noVBand="1" w:val="04A0"/>
+      </w:tblPr>
+      <w:tblGrid>
+        <w:gridCol w:w="2646"/>
+        <w:gridCol w:w="2646"/>
+        <w:gridCol w:w="2646"/>
+      </w:tblGrid>
+      <w:tr>
+        <w:tc>
+          <w:tcPr>
+            <w:tcW w:type="dxa" w:w="2646"/>
+          </w:tcPr>
+          <w:p>
+            <w:r>
+              <w:rPr>
+                <w:rFonts w:ascii="Times New Roman" w:hAnsi="Times New Roman"/>
+                <w:sz w:val="20"/>
+              </w:rPr>
+              <w:t>Tingkat Pengetahuan</w:t>
+            </w:r>
+          </w:p>
+        </w:tc>
+        <w:tc>
+          <w:tcPr>
+            <w:tcW w:type="dxa" w:w="2646"/>
+          </w:tcPr>
+          <w:p>
+            <w:r>
+              <w:rPr>
+                <w:rFonts w:ascii="Times New Roman" w:hAnsi="Times New Roman"/>
+                <w:sz w:val="20"/>
+              </w:rPr>
+              <w:t>Jumlah (f)</w:t>
+            </w:r>
+          </w:p>
+        </w:tc>
+        <w:tc>
+          <w:tcPr>
+            <w:tcW w:type="dxa" w:w="2646"/>
+          </w:tcPr>
+          <w:p>
+            <w:r>
+              <w:rPr>
+                <w:rFonts w:ascii="Times New Roman" w:hAnsi="Times New Roman"/>
+                <w:sz w:val="20"/>
+              </w:rPr>
+              <w:t>Persentase (%)</w:t>
+            </w:r>
+          </w:p>
+        </w:tc>
+      </w:tr>
+      <w:tr>
+        <w:tc>
+          <w:tcPr>
+            <w:tcW w:type="dxa" w:w="2646"/>
+          </w:tcPr>
+          <w:p>
+            <w:r>
+              <w:rPr>
+                <w:rFonts w:ascii="Times New Roman" w:hAnsi="Times New Roman"/>
+                <w:sz w:val="20"/>
+              </w:rPr>
+              <w:t>Baik</w:t>
+            </w:r>
+          </w:p>
+        </w:tc>
+        <w:tc>
+          <w:tcPr>
+            <w:tcW w:type="dxa" w:w="2646"/>
+          </w:tcPr>
+          <w:p>
+            <w:r>
+              <w:rPr>
+                <w:rFonts w:ascii="Times New Roman" w:hAnsi="Times New Roman"/>
+                <w:sz w:val="20"/>
+              </w:rPr>
+              <w:t>....</w:t>
+            </w:r>
+          </w:p>
+        </w:tc>
+        <w:tc>
+          <w:tcPr>
+            <w:tcW w:type="dxa" w:w="2646"/>
+          </w:tcPr>
+          <w:p>
+            <w:r>
+              <w:rPr>
+                <w:rFonts w:ascii="Times New Roman" w:hAnsi="Times New Roman"/>
+                <w:sz w:val="20"/>
+              </w:rPr>
+              <w:t>....</w:t>
+            </w:r>
+          </w:p>
+        </w:tc>
+      </w:tr>
+      <w:tr>
+        <w:tc>
+          <w:tcPr>
+            <w:tcW w:type="dxa" w:w="2646"/>
+          </w:tcPr>
+          <w:p>
+            <w:r>
+              <w:rPr>
+                <w:rFonts w:ascii="Times New Roman" w:hAnsi="Times New Roman"/>
+                <w:sz w:val="20"/>
+              </w:rPr>
+              <w:t>Cukup</w:t>
+            </w:r>
+          </w:p>
+        </w:tc>
+        <w:tc>
+          <w:tcPr>
+            <w:tcW w:type="dxa" w:w="2646"/>
+          </w:tcPr>
+          <w:p>
+            <w:r>
+              <w:rPr>
+                <w:rFonts w:ascii="Times New Roman" w:hAnsi="Times New Roman"/>
+                <w:sz w:val="20"/>
+              </w:rPr>
+              <w:t>....</w:t>
+            </w:r>
+          </w:p>
+        </w:tc>
+        <w:tc>
+          <w:tcPr>
+            <w:tcW w:type="dxa" w:w="2646"/>
+          </w:tcPr>
+          <w:p>
+            <w:r>
+              <w:rPr>
+                <w:rFonts w:ascii="Times New Roman" w:hAnsi="Times New Roman"/>
+                <w:sz w:val="20"/>
+              </w:rPr>
+              <w:t>....</w:t>
+            </w:r>
+          </w:p>
+        </w:tc>
+      </w:tr>
+      <w:tr>
+        <w:tc>
+          <w:tcPr>
+            <w:tcW w:type="dxa" w:w="2646"/>
+          </w:tcPr>
+          <w:p>
+            <w:r>
+              <w:rPr>
+                <w:rFonts w:ascii="Times New Roman" w:hAnsi="Times New Roman"/>
+                <w:sz w:val="20"/>
+              </w:rPr>
+              <w:t>Kurang</w:t>
+            </w:r>
+          </w:p>
+        </w:tc>
+        <w:tc>
+          <w:tcPr>
+            <w:tcW w:type="dxa" w:w="2646"/>
+          </w:tcPr>
+          <w:p>
+            <w:r>
+              <w:rPr>
+                <w:rFonts w:ascii="Times New Roman" w:hAnsi="Times New Roman"/>
+                <w:sz w:val="20"/>
+              </w:rPr>
+              <w:t>....</w:t>
+            </w:r>
+          </w:p>
+        </w:tc>
+        <w:tc>
+          <w:tcPr>
+            <w:tcW w:type="dxa" w:w="2646"/>
+          </w:tcPr>
+          <w:p>
+            <w:r>
+              <w:rPr>
+                <w:rFonts w:ascii="Times New Roman" w:hAnsi="Times New Roman"/>
+                <w:sz w:val="20"/>
+              </w:rPr>
+              <w:t>....</w:t>
+            </w:r>
+          </w:p>
+        </w:tc>
+      </w:tr>
+      <w:tr>
+        <w:tc>
+          <w:tcPr>
+            <w:tcW w:type="dxa" w:w="2646"/>
+          </w:tcPr>
+          <w:p>
+            <w:r>
+              <w:rPr>
+                <w:rFonts w:ascii="Times New Roman" w:hAnsi="Times New Roman"/>
+                <w:sz w:val="20"/>
+              </w:rPr>
+              <w:t>Jumlah</w:t>
+            </w:r>
+          </w:p>
+        </w:tc>
+        <w:tc>
+          <w:tcPr>
+            <w:tcW w:type="dxa" w:w="2646"/>
+          </w:tcPr>
+          <w:p>
+            <w:r>
+              <w:rPr>
+                <w:rFonts w:ascii="Times New Roman" w:hAnsi="Times New Roman"/>
+                <w:sz w:val="20"/>
+              </w:rPr>
+              <w:t>....</w:t>
+            </w:r>
+          </w:p>
+        </w:tc>
+        <w:tc>
+          <w:tcPr>
+            <w:tcW w:type="dxa" w:w="2646"/>
+          </w:tcPr>
+          <w:p>
+            <w:r>
+              <w:rPr>
+                <w:rFonts w:ascii="Times New Roman" w:hAnsi="Times New Roman"/>
+                <w:sz w:val="20"/>
+              </w:rPr>
+              <w:t>100</w:t>
+            </w:r>
+          </w:p>
+        </w:tc>
+      </w:tr>
+    </w:tbl>
     <w:p>
       <w:pPr>
         <w:pStyle w:val="Judul1"/>
       </w:pPr>
-      <w:r>
-        <w:br/>
-      </w:r>
       <w:bookmarkStart w:id="39" w:name="_Toc121754055"/>
-      <w:r>
-        <w:t>ANALISIS DAN PEMBAHASAN</w:t>
-      </w:r>
       <w:bookmarkEnd w:id="39"/>
+      <w:r>
+        <w:t>Analisis Bivariat</w:t>
+      </w:r>
     </w:p>
     <w:p>
       <w:pPr>
@@ -11964,17 +12218,331 @@
         <w:spacing w:after="160"/>
       </w:pPr>
       <w:bookmarkStart w:id="40" w:name="_Toc121754056"/>
-      <w:r>
-        <w:t>Analisis</w:t>
-      </w:r>
       <w:bookmarkEnd w:id="40"/>
-    </w:p>
+      <w:r>
+        <w:t>Analisis bivariat dilakukan untuk menguji hipotesis penelitian menggunakan uji chi-square dengan tingkat kemaknaan α = 0,05. Tabulasi silang antara pengetahuan ibu nifas tentang manfaat daun katuk dengan pemberian ASI eksklusif disajikan pada Tabel 4.2 berikut. (Petunjuk: isi tabel setelah data terkumpul, lalu laporkan nilai p-value dan keputusan hipotesis, misalnya "p = 0,002 &lt; 0,05 sehingga Ha diterima".)</w:t>
+      </w:r>
+    </w:p>
+    <w:p>
+      <w:pPr>
+        <w:pStyle w:val="StyleGambar"/>
+        <w:spacing w:after="160"/>
+      </w:pPr>
+      <w:bookmarkStart w:id="40" w:name="_Toc121754056"/>
+      <w:bookmarkEnd w:id="40"/>
+      <w:r>
+        <w:t>Tabel 4.2 Tabulasi Silang Pengetahuan dengan Pemberian ASI Eksklusif</w:t>
+      </w:r>
+    </w:p>
+    <w:tbl>
+      <w:tblPr>
+        <w:tblStyle w:val="KisiTabel"/>
+        <w:tblW w:type="auto" w:w="0"/>
+        <w:tblLook w:firstColumn="1" w:firstRow="1" w:lastColumn="0" w:lastRow="0" w:noHBand="0" w:noVBand="1" w:val="04A0"/>
+      </w:tblPr>
+      <w:tblGrid>
+        <w:gridCol w:w="1984"/>
+        <w:gridCol w:w="1984"/>
+        <w:gridCol w:w="1984"/>
+        <w:gridCol w:w="1984"/>
+      </w:tblGrid>
+      <w:tr>
+        <w:tc>
+          <w:tcPr>
+            <w:tcW w:type="dxa" w:w="1984"/>
+          </w:tcPr>
+          <w:p>
+            <w:r>
+              <w:rPr>
+                <w:rFonts w:ascii="Times New Roman" w:hAnsi="Times New Roman"/>
+                <w:sz w:val="20"/>
+              </w:rPr>
+              <w:t>Tingkat Pengetahuan</w:t>
+            </w:r>
+          </w:p>
+        </w:tc>
+        <w:tc>
+          <w:tcPr>
+            <w:tcW w:type="dxa" w:w="1984"/>
+          </w:tcPr>
+          <w:p>
+            <w:r>
+              <w:rPr>
+                <w:rFonts w:ascii="Times New Roman" w:hAnsi="Times New Roman"/>
+                <w:sz w:val="20"/>
+              </w:rPr>
+              <w:t>ASI Eksklusif (Ya)</w:t>
+            </w:r>
+          </w:p>
+        </w:tc>
+        <w:tc>
+          <w:tcPr>
+            <w:tcW w:type="dxa" w:w="1984"/>
+          </w:tcPr>
+          <w:p>
+            <w:r>
+              <w:rPr>
+                <w:rFonts w:ascii="Times New Roman" w:hAnsi="Times New Roman"/>
+                <w:sz w:val="20"/>
+              </w:rPr>
+              <w:t>ASI Eksklusif (Tidak)</w:t>
+            </w:r>
+          </w:p>
+        </w:tc>
+        <w:tc>
+          <w:tcPr>
+            <w:tcW w:type="dxa" w:w="1984"/>
+          </w:tcPr>
+          <w:p>
+            <w:r>
+              <w:rPr>
+                <w:rFonts w:ascii="Times New Roman" w:hAnsi="Times New Roman"/>
+                <w:sz w:val="20"/>
+              </w:rPr>
+              <w:t>Jumlah</w:t>
+            </w:r>
+          </w:p>
+        </w:tc>
+      </w:tr>
+      <w:tr>
+        <w:tc>
+          <w:tcPr>
+            <w:tcW w:type="dxa" w:w="1984"/>
+          </w:tcPr>
+          <w:p>
+            <w:r>
+              <w:rPr>
+                <w:rFonts w:ascii="Times New Roman" w:hAnsi="Times New Roman"/>
+                <w:sz w:val="20"/>
+              </w:rPr>
+              <w:t>Baik</w:t>
+            </w:r>
+          </w:p>
+        </w:tc>
+        <w:tc>
+          <w:tcPr>
+            <w:tcW w:type="dxa" w:w="1984"/>
+          </w:tcPr>
+          <w:p>
+            <w:r>
+              <w:rPr>
+                <w:rFonts w:ascii="Times New Roman" w:hAnsi="Times New Roman"/>
+                <w:sz w:val="20"/>
+              </w:rPr>
+              <w:t>....</w:t>
+            </w:r>
+          </w:p>
+        </w:tc>
+        <w:tc>
+          <w:tcPr>
+            <w:tcW w:type="dxa" w:w="1984"/>
+          </w:tcPr>
+          <w:p>
+            <w:r>
+              <w:rPr>
+                <w:rFonts w:ascii="Times New Roman" w:hAnsi="Times New Roman"/>
+                <w:sz w:val="20"/>
+              </w:rPr>
+              <w:t>....</w:t>
+            </w:r>
+          </w:p>
+        </w:tc>
+        <w:tc>
+          <w:tcPr>
+            <w:tcW w:type="dxa" w:w="1984"/>
+          </w:tcPr>
+          <w:p>
+            <w:r>
+              <w:rPr>
+                <w:rFonts w:ascii="Times New Roman" w:hAnsi="Times New Roman"/>
+                <w:sz w:val="20"/>
+              </w:rPr>
+              <w:t>....</w:t>
+            </w:r>
+          </w:p>
+        </w:tc>
+      </w:tr>
+      <w:tr>
+        <w:tc>
+          <w:tcPr>
+            <w:tcW w:type="dxa" w:w="1984"/>
+          </w:tcPr>
+          <w:p>
+            <w:r>
+              <w:rPr>
+                <w:rFonts w:ascii="Times New Roman" w:hAnsi="Times New Roman"/>
+                <w:sz w:val="20"/>
+              </w:rPr>
+              <w:t>Cukup</w:t>
+            </w:r>
+          </w:p>
+        </w:tc>
+        <w:tc>
+          <w:tcPr>
+            <w:tcW w:type="dxa" w:w="1984"/>
+          </w:tcPr>
+          <w:p>
+            <w:r>
+              <w:rPr>
+                <w:rFonts w:ascii="Times New Roman" w:hAnsi="Times New Roman"/>
+                <w:sz w:val="20"/>
+              </w:rPr>
+              <w:t>....</w:t>
+            </w:r>
+          </w:p>
+        </w:tc>
+        <w:tc>
+          <w:tcPr>
+            <w:tcW w:type="dxa" w:w="1984"/>
+          </w:tcPr>
+          <w:p>
+            <w:r>
+              <w:rPr>
+                <w:rFonts w:ascii="Times New Roman" w:hAnsi="Times New Roman"/>
+                <w:sz w:val="20"/>
+              </w:rPr>
+              <w:t>....</w:t>
+            </w:r>
+          </w:p>
+        </w:tc>
+        <w:tc>
+          <w:tcPr>
+            <w:tcW w:type="dxa" w:w="1984"/>
+          </w:tcPr>
+          <w:p>
+            <w:r>
+              <w:rPr>
+                <w:rFonts w:ascii="Times New Roman" w:hAnsi="Times New Roman"/>
+                <w:sz w:val="20"/>
+              </w:rPr>
+              <w:t>....</w:t>
+            </w:r>
+          </w:p>
+        </w:tc>
+      </w:tr>
+      <w:tr>
+        <w:tc>
+          <w:tcPr>
+            <w:tcW w:type="dxa" w:w="1984"/>
+          </w:tcPr>
+          <w:p>
+            <w:r>
+              <w:rPr>
+                <w:rFonts w:ascii="Times New Roman" w:hAnsi="Times New Roman"/>
+                <w:sz w:val="20"/>
+              </w:rPr>
+              <w:t>Kurang</w:t>
+            </w:r>
+          </w:p>
+        </w:tc>
+        <w:tc>
+          <w:tcPr>
+            <w:tcW w:type="dxa" w:w="1984"/>
+          </w:tcPr>
+          <w:p>
+            <w:r>
+              <w:rPr>
+                <w:rFonts w:ascii="Times New Roman" w:hAnsi="Times New Roman"/>
+                <w:sz w:val="20"/>
+              </w:rPr>
+              <w:t>....</w:t>
+            </w:r>
+          </w:p>
+        </w:tc>
+        <w:tc>
+          <w:tcPr>
+            <w:tcW w:type="dxa" w:w="1984"/>
+          </w:tcPr>
+          <w:p>
+            <w:r>
+              <w:rPr>
+                <w:rFonts w:ascii="Times New Roman" w:hAnsi="Times New Roman"/>
+                <w:sz w:val="20"/>
+              </w:rPr>
+              <w:t>....</w:t>
+            </w:r>
+          </w:p>
+        </w:tc>
+        <w:tc>
+          <w:tcPr>
+            <w:tcW w:type="dxa" w:w="1984"/>
+          </w:tcPr>
+          <w:p>
+            <w:r>
+              <w:rPr>
+                <w:rFonts w:ascii="Times New Roman" w:hAnsi="Times New Roman"/>
+                <w:sz w:val="20"/>
+              </w:rPr>
+              <w:t>....</w:t>
+            </w:r>
+          </w:p>
+        </w:tc>
+      </w:tr>
+      <w:tr>
+        <w:tc>
+          <w:tcPr>
+            <w:tcW w:type="dxa" w:w="1984"/>
+          </w:tcPr>
+          <w:p>
+            <w:r>
+              <w:rPr>
+                <w:rFonts w:ascii="Times New Roman" w:hAnsi="Times New Roman"/>
+                <w:sz w:val="20"/>
+              </w:rPr>
+              <w:t>Jumlah</w:t>
+            </w:r>
+          </w:p>
+        </w:tc>
+        <w:tc>
+          <w:tcPr>
+            <w:tcW w:type="dxa" w:w="1984"/>
+          </w:tcPr>
+          <w:p>
+            <w:r>
+              <w:rPr>
+                <w:rFonts w:ascii="Times New Roman" w:hAnsi="Times New Roman"/>
+                <w:sz w:val="20"/>
+              </w:rPr>
+              <w:t>....</w:t>
+            </w:r>
+          </w:p>
+        </w:tc>
+        <w:tc>
+          <w:tcPr>
+            <w:tcW w:type="dxa" w:w="1984"/>
+          </w:tcPr>
+          <w:p>
+            <w:r>
+              <w:rPr>
+                <w:rFonts w:ascii="Times New Roman" w:hAnsi="Times New Roman"/>
+                <w:sz w:val="20"/>
+              </w:rPr>
+              <w:t>....</w:t>
+            </w:r>
+          </w:p>
+        </w:tc>
+        <w:tc>
+          <w:tcPr>
+            <w:tcW w:type="dxa" w:w="1984"/>
+          </w:tcPr>
+          <w:p>
+            <w:r>
+              <w:rPr>
+                <w:rFonts w:ascii="Times New Roman" w:hAnsi="Times New Roman"/>
+                <w:sz w:val="20"/>
+              </w:rPr>
+              <w:t>....</w:t>
+            </w:r>
+          </w:p>
+        </w:tc>
+      </w:tr>
+    </w:tbl>
     <w:p>
       <w:pPr>
         <w:pStyle w:val="StyleIsiParagraf"/>
       </w:pPr>
       <w:r>
-        <w:t>Pada bagian ini dipaparkan pembuatan atau implementasi sistem yang dibangun, percobaan atau pengujian yang dilakukan, analisis dari pengujian yang dilakukan dan dibahas secara detail dalam bentuk kualitatif, kuantitatif atau statistik terhadap hasil yang dicapai dalam pengujian.</w:t>
+        <w:t>Pembahasan</w:t>
       </w:r>
     </w:p>
     <w:p>
@@ -11982,7 +12550,7 @@
         <w:pStyle w:val="StyleIsiParagraf"/>
       </w:pPr>
       <w:r>
-        <w:t>Hal-hal yang dipaparkan dalam bagian ini harus sesuai dengan metode yang dicantumkan pada bab metodologi penelitian. Pembahasan dari hasil pengujian yang dikaitkan dengan penelitian lain harus merujuk pada bab landasan teori. Apabila terdapat petunjuk penggunaan aplikasi, petunjuk tersebut tidak disertakan dalam bab ini, tetapi diletakkan pada bagian lampiran skripsi.</w:t>
+        <w:t>(Petunjuk: bahas temuan penelitian dengan mengaitkan hasil analisis bivariat dengan hipotesis yang diajukan pada BAB II. Bandingkan temuan dengan penelitian terdahulu, misalnya Pambudi (2022) tentang hubungan pengetahuan dengan pemberian ASI, serta Dolang dkk. (2021) dan Situmorang (2019) tentang manfaat daun katuk terhadap produksi ASI. Jelaskan pula keterkaitan temuan dengan teori pengetahuan Notoatmodjo (2012) dan keterbatasan penelitian.)</w:t>
       </w:r>
     </w:p>
     <w:p>

</xml_diff>

<commit_message>
Rebuild: identitas lengkap (NIM/STIKES Yahya Bima), BAB IV dikosongkan ke petunjuk default, perbaikan format, referensi Asnidawati 2021
</commit_message>
<xml_diff>
--- a/Skripsi_Arni_Kandokang_Madik_BAB1-3.docx
+++ b/Skripsi_Arni_Kandokang_Madik_BAB1-3.docx
@@ -166,7 +166,7 @@
         <w:jc w:val="center"/>
       </w:pPr>
       <w:r>
-        <w:t>NIM .........................</w:t>
+        <w:t>NIM 2024020007</w:t>
       </w:r>
     </w:p>
     <w:p>
@@ -188,7 +188,7 @@
         </w:rPr>
       </w:pPr>
       <w:r>
-        <w:t>PROGRAM STUDI .........................</w:t>
+        <w:t>PROGRAM STUDI D-III KEBIDANAN</w:t>
       </w:r>
     </w:p>
     <w:p>
@@ -200,7 +200,7 @@
         </w:rPr>
       </w:pPr>
       <w:r>
-        <w:t>FAKULTAS .........................</w:t>
+        <w:t>SEKOLAH TINGGI ILMU KESEHATAN YAHYA BIMA</w:t>
       </w:r>
     </w:p>
     <w:p>
@@ -212,7 +212,7 @@
         </w:rPr>
       </w:pPr>
       <w:r>
-        <w:t>UNIVERSITAS .........................</w:t>
+        <w:t>BIMA</w:t>
       </w:r>
     </w:p>
     <w:p>
@@ -399,7 +399,7 @@
         </w:rPr>
       </w:pPr>
       <w:r>
-        <w:t>NIM .........................</w:t>
+        <w:t>NIM 2024020007</w:t>
       </w:r>
     </w:p>
     <w:p>
@@ -421,7 +421,7 @@
         </w:rPr>
       </w:pPr>
       <w:r>
-        <w:t>PROGRAM STUDI .........................</w:t>
+        <w:t>PROGRAM STUDI D-III KEBIDANAN</w:t>
       </w:r>
     </w:p>
     <w:p>
@@ -433,7 +433,7 @@
         </w:rPr>
       </w:pPr>
       <w:r>
-        <w:t>FAKULTAS .........................</w:t>
+        <w:t>SEKOLAH TINGGI ILMU KESEHATAN YAHYA BIMA</w:t>
       </w:r>
     </w:p>
     <w:p>
@@ -445,7 +445,7 @@
         </w:rPr>
       </w:pPr>
       <w:r>
-        <w:t>UNIVERSITAS .........................</w:t>
+        <w:t>BIMA</w:t>
       </w:r>
     </w:p>
     <w:p>
@@ -6271,7 +6271,7 @@
         <w:tab/>
         <w:t>:</w:t>
         <w:tab/>
-        <w:t>........................</w:t>
+        <w:t>2024020007</w:t>
       </w:r>
     </w:p>
     <w:p>
@@ -6283,14 +6283,10 @@
       </w:pPr>
       <w:r>
         <w:t>Program Studi</w:t>
-      </w:r>
-      <w:r>
         <w:tab/>
         <w:t>:</w:t>
-      </w:r>
-      <w:r>
         <w:tab/>
-        <w:t>Teknik Informatika</w:t>
+        <w:t>D-III Kebidanan</w:t>
       </w:r>
     </w:p>
     <w:p>
@@ -6328,7 +6324,7 @@
         </w:tabs>
       </w:pPr>
       <w:r>
-        <w:t>................, ......................... 2026</w:t>
+        <w:t>Bima, ......................... 2026</w:t>
       </w:r>
     </w:p>
     <w:p>
@@ -6397,7 +6393,7 @@
         </w:sectPr>
       </w:pPr>
       <w:r>
-        <w:t>NIM .........................</w:t>
+        <w:t>NIM 2024020007</w:t>
       </w:r>
     </w:p>
     <w:p>
@@ -10853,7 +10849,7 @@
       <w:bookmarkStart w:id="18" w:name="_Toc121754039"/>
       <w:bookmarkEnd w:id="18"/>
       <w:r>
-        <w:t>Masa nifas adalah masa kritis bagi keberhasilan menyusui karena pada masa ini ibu mengalami perubahan fisik dan psikologis sekaligus mulai membangun kebiasaan pemberian ASI. Berdasarkan uraian tersebut, peneliti tertarik mengetahui apakah pengetahuan ibu nifas tentang manfaat daun katuk berhubungan dengan pemberian ASI eksklusif. Hasil penelitian ini diharapkan dapat menjadi masukan bagi tenaga kesehatan dalam memberikan edukasi gizi ibu nifas yang lebih tepat sasaran.</w:t>
+        <w:t>Keberhasilan pemberian ASI eksklusif dipengaruhi banyak faktor, salah satunya adalah pengetahuan ibu. Penelitian Pambudi (2022) menunjukkan terdapat hubungan bermakna antara pengetahuan ibu tentang kiat sukses ASI eksklusif dengan riwayat pemberian ASI (p-value 0,026). Ibu yang memiliki pengetahuan baik tentang manfaat ASI dan cara penyusuan yang benar akan lebih percaya diri dan termotivasi untuk memberikan ASI secara eksklusif. Sebaliknya, rendahnya pengetahuan menjadi salah satu penyebab ibu memberikan makanan pendamping terlalu dini.</w:t>
       </w:r>
     </w:p>
     <w:p>
@@ -10862,7 +10858,9 @@
       </w:pPr>
       <w:bookmarkStart w:id="18" w:name="_Toc121754039"/>
       <w:bookmarkEnd w:id="18"/>
-      <w:r/>
+      <w:r>
+        <w:t>Pengetahuan ibu tidak hanya mencakup ASI itu sendiri, tetapi juga makanan atau tanaman yang dipercaya dapat melancarkan produksi ASI. Di Indonesia, daun katuk (Sauropus androgynus (L.) Merr.) secara turun-temurun digunakan sebagai laktogogum, yaitu bahan yang dapat meningkatkan produksi ASI. Berbagai penelitian membuktikan manfaat tersebut: Dolang dkk. (2021) menemukan pemberian rebusan daun katuk berpengaruh terhadap peningkatan produksi ASI pada ibu nifas (p = 0,000), dan Juliastuti (2019) menemukan daun katuk efektif terhadap kecukupan ASI pada ibu menyusui. Kandungan protein, fitosterol, dan senyawa aktif lainnya dalam daun katuk diduga merangsang pengeluaran hormon prolaktin yang berperan dalam produksi ASI.</w:t>
+      </w:r>
     </w:p>
     <w:p>
       <w:pPr>
@@ -10871,7 +10869,26 @@
       <w:bookmarkStart w:id="18" w:name="_Toc121754039"/>
       <w:bookmarkEnd w:id="18"/>
       <w:r>
-        <w:t>Keberhasilan pemberian ASI eksklusif dipengaruhi banyak faktor, salah satunya adalah pengetahuan ibu. Penelitian Pambudi (2022) menunjukkan terdapat hubungan bermakna antara pengetahuan ibu tentang kiat sukses ASI eksklusif dengan riwayat pemberian ASI (p-value 0,026). Ibu yang memiliki pengetahuan baik tentang manfaat ASI dan cara penyusuan yang benar akan lebih percaya diri dan termotivasi untuk memberikan ASI secara eksklusif. Sebaliknya, rendahnya pengetahuan menjadi salah satu penyebab ibu memberikan makanan pendamping terlalu dini.</w:t>
+        <w:t>Masa nifas adalah masa kritis bagi keberhasilan menyusui karena pada masa ini ibu mengalami perubahan fisik dan psikologis sekaligus mulai membangun kebiasaan pemberian ASI. Berdasarkan uraian tersebut, peneliti tertarik mengetahui apakah pengetahuan ibu nifas tentang manfaat daun katuk berhubungan dengan pemberian ASI eksklusif. Hasil penelitian ini diharapkan dapat menjadi masukan bagi tenaga kesehatan dalam memberikan edukasi gizi ibu nifas yang lebih tepat sasaran.</w:t>
+      </w:r>
+    </w:p>
+    <w:p>
+      <w:pPr>
+        <w:pStyle w:val="Judul2"/>
+        <w:spacing w:after="160"/>
+      </w:pPr>
+      <w:bookmarkStart w:id="19" w:name="_Toc121754040"/>
+      <w:r>
+        <w:t>Rumusan Masalah</w:t>
+      </w:r>
+      <w:bookmarkEnd w:id="19"/>
+    </w:p>
+    <w:p>
+      <w:pPr>
+        <w:pStyle w:val="StyleIsiParagraf"/>
+      </w:pPr>
+      <w:r>
+        <w:t>Berdasarkan latar belakang tersebut, rumusan masalah penelitian ini adalah:</w:t>
       </w:r>
     </w:p>
     <w:p>
@@ -10881,7 +10898,27 @@
       <w:bookmarkStart w:id="18" w:name="_Toc121754039"/>
       <w:bookmarkEnd w:id="18"/>
       <w:r>
-        <w:t>Pengetahuan ibu tidak hanya mencakup ASI itu sendiri, tetapi juga makanan atau tanaman yang dipercaya dapat melancarkan produksi ASI. Di Indonesia, daun katuk (Sauropus androgynus (L.) Merr.) secara turun-temurun digunakan sebagai laktogogum, yaitu bahan yang dapat meningkatkan produksi ASI. Berbagai penelitian membuktikan manfaat tersebut: Dolang dkk. (2021) menemukan pemberian rebusan daun katuk berpengaruh terhadap peningkatan produksi ASI pada ibu nifas (p = 0,000), dan Juliastuti (2019) menemukan daun katuk efektif terhadap kecukupan ASI pada ibu menyusui. Kandungan protein, fitosterol, dan senyawa aktif lainnya dalam daun katuk diduga merangsang pengeluaran hormon prolaktin yang berperan dalam produksi ASI.</w:t>
+        <w:t>1. Bagaimana gambaran tingkat pengetahuan ibu nifas tentang manfaat daun katuk di wilayah kerja ................?</w:t>
+      </w:r>
+    </w:p>
+    <w:p>
+      <w:pPr>
+        <w:pStyle w:val="StyleIsiParagraf"/>
+      </w:pPr>
+      <w:bookmarkStart w:id="18" w:name="_Toc121754039"/>
+      <w:bookmarkEnd w:id="18"/>
+      <w:r>
+        <w:t>2. Bagaimana gambaran pemberian ASI eksklusif pada ibu nifas di wilayah kerja ................?</w:t>
+      </w:r>
+    </w:p>
+    <w:p>
+      <w:pPr>
+        <w:pStyle w:val="StyleIsiParagraf"/>
+      </w:pPr>
+      <w:bookmarkStart w:id="18" w:name="_Toc121754039"/>
+      <w:bookmarkEnd w:id="18"/>
+      <w:r>
+        <w:t>3. Apakah ada hubungan antara pengetahuan ibu nifas tentang manfaat daun katuk dengan pemberian ASI eksklusif?</w:t>
       </w:r>
     </w:p>
     <w:p>
@@ -10889,42 +10926,58 @@
         <w:pStyle w:val="Judul2"/>
         <w:spacing w:after="160"/>
       </w:pPr>
-      <w:bookmarkStart w:id="19" w:name="_Toc121754040"/>
-      <w:r>
-        <w:t>Rumusan Masalah</w:t>
-      </w:r>
-      <w:bookmarkEnd w:id="19"/>
+      <w:bookmarkStart w:id="20" w:name="_Toc121754041"/>
+      <w:r>
+        <w:t>Batasan Masalah</w:t>
+      </w:r>
+      <w:bookmarkEnd w:id="20"/>
     </w:p>
     <w:p>
       <w:pPr>
         <w:pStyle w:val="StyleIsiParagraf"/>
       </w:pPr>
       <w:r>
-        <w:t>Berdasarkan latar belakang tersebut, rumusan masalah penelitian ini adalah:</w:t>
+        <w:t>Agar penelitian ini lebih terarah, permasalahan dibatasi pada hal-hal berikut:</w:t>
       </w:r>
     </w:p>
     <w:p>
       <w:pPr>
         <w:pStyle w:val="StyleIsiParagraf"/>
       </w:pPr>
-      <w:r>
-        <w:t>1. Bagaimana gambaran tingkat pengetahuan ibu nifas tentang manfaat daun katuk di wilayah kerja ................?</w:t>
+      <w:bookmarkStart w:id="18" w:name="_Toc121754039"/>
+      <w:bookmarkEnd w:id="18"/>
+      <w:r>
+        <w:t>1. Penelitian dilakukan pada ibu nifas yang berkunjung atau bertempat tinggal di wilayah kerja ................ pada tahun 2026.</w:t>
       </w:r>
     </w:p>
     <w:p>
       <w:pPr>
         <w:pStyle w:val="StyleIsiParagraf"/>
       </w:pPr>
-      <w:r>
-        <w:t>2. Bagaimana gambaran pemberian ASI eksklusif pada ibu nifas di wilayah kerja ................?</w:t>
+      <w:bookmarkStart w:id="18" w:name="_Toc121754039"/>
+      <w:bookmarkEnd w:id="18"/>
+      <w:r>
+        <w:t>2. Variabel bebas adalah pengetahuan ibu nifas tentang manfaat daun katuk.</w:t>
       </w:r>
     </w:p>
     <w:p>
       <w:pPr>
         <w:pStyle w:val="StyleIsiParagraf"/>
       </w:pPr>
-      <w:r>
-        <w:t>3. Apakah ada hubungan antara pengetahuan ibu nifas tentang manfaat daun katuk dengan pemberian ASI eksklusif?</w:t>
+      <w:bookmarkStart w:id="18" w:name="_Toc121754039"/>
+      <w:bookmarkEnd w:id="18"/>
+      <w:r>
+        <w:t>3. Variabel terikat adalah pemberian ASI eksklusif.</w:t>
+      </w:r>
+    </w:p>
+    <w:p>
+      <w:pPr>
+        <w:pStyle w:val="StyleIsiParagraf"/>
+      </w:pPr>
+      <w:bookmarkStart w:id="18" w:name="_Toc121754039"/>
+      <w:bookmarkEnd w:id="18"/>
+      <w:r>
+        <w:t>4. Pengetahuan diukur menggunakan kuesioner tertutup, dan pemberian ASI eksklusif dinyatakan ibu sendiri melalui kuesioner.</w:t>
       </w:r>
     </w:p>
     <w:p>
@@ -10932,91 +10985,46 @@
         <w:pStyle w:val="Judul2"/>
         <w:spacing w:after="160"/>
       </w:pPr>
-      <w:bookmarkStart w:id="20" w:name="_Toc121754041"/>
-      <w:r>
-        <w:t>Batasan Masalah</w:t>
-      </w:r>
-      <w:bookmarkEnd w:id="20"/>
+      <w:bookmarkStart w:id="21" w:name="_Toc121754042"/>
+      <w:r>
+        <w:t>Tujuan Penelitian</w:t>
+      </w:r>
+      <w:bookmarkEnd w:id="21"/>
     </w:p>
     <w:p>
       <w:pPr>
         <w:pStyle w:val="StyleIsiParagraf"/>
       </w:pPr>
       <w:r>
-        <w:t>Agar penelitian ini lebih terarah, permasalahan dibatasi pada hal-hal berikut:</w:t>
+        <w:t>Tujuan penelitian ini adalah untuk menganalisis hubungan antara pengetahuan ibu nifas tentang manfaat daun katuk dengan pemberian ASI eksklusif. Secara khusus, penelitian ini bertujuan:</w:t>
       </w:r>
     </w:p>
     <w:p>
       <w:pPr>
         <w:pStyle w:val="StyleIsiParagraf"/>
       </w:pPr>
-      <w:r>
-        <w:t>1. Penelitian dilakukan pada ibu nifas yang berkunjung atau bertempat tinggal di wilayah kerja ................ pada tahun 2026.</w:t>
+      <w:bookmarkStart w:id="18" w:name="_Toc121754039"/>
+      <w:bookmarkEnd w:id="18"/>
+      <w:r>
+        <w:t>1. Mengidentifikasi tingkat pengetahuan ibu nifas tentang manfaat daun katuk.</w:t>
       </w:r>
     </w:p>
     <w:p>
       <w:pPr>
         <w:pStyle w:val="StyleIsiParagraf"/>
       </w:pPr>
-      <w:r>
-        <w:t>2. Variabel bebas adalah pengetahuan ibu nifas tentang manfaat daun katuk.</w:t>
+      <w:bookmarkStart w:id="18" w:name="_Toc121754039"/>
+      <w:bookmarkEnd w:id="18"/>
+      <w:r>
+        <w:t>2. Mengidentifikasi pemberian ASI eksklusif pada ibu nifas.</w:t>
       </w:r>
     </w:p>
     <w:p>
       <w:pPr>
         <w:pStyle w:val="StyleIsiParagraf"/>
       </w:pPr>
-      <w:r>
-        <w:t>3. Variabel terikat adalah pemberian ASI eksklusif.</w:t>
-      </w:r>
-    </w:p>
-    <w:p>
-      <w:pPr>
-        <w:pStyle w:val="StyleIsiParagraf"/>
-      </w:pPr>
-      <w:r>
-        <w:t>4. Pengetahuan diukur menggunakan kuesioner tertutup, dan pemberian ASI eksklusif dinyatakan ibu sendiri melalui kuesioner.</w:t>
-      </w:r>
-    </w:p>
-    <w:p>
-      <w:pPr>
-        <w:pStyle w:val="Judul2"/>
-        <w:spacing w:after="160"/>
-      </w:pPr>
-      <w:bookmarkStart w:id="21" w:name="_Toc121754042"/>
-      <w:r>
-        <w:t>Tujuan Penelitian</w:t>
-      </w:r>
-      <w:bookmarkEnd w:id="21"/>
-    </w:p>
-    <w:p>
-      <w:pPr>
-        <w:pStyle w:val="StyleIsiParagraf"/>
-      </w:pPr>
-      <w:r>
-        <w:t>Tujuan penelitian ini adalah untuk menganalisis hubungan antara pengetahuan ibu nifas tentang manfaat daun katuk dengan pemberian ASI eksklusif. Secara khusus, penelitian ini bertujuan:</w:t>
-      </w:r>
-    </w:p>
-    <w:p>
-      <w:pPr>
-        <w:pStyle w:val="StyleIsiParagraf"/>
-      </w:pPr>
-      <w:r>
-        <w:t>1. Mengidentifikasi tingkat pengetahuan ibu nifas tentang manfaat daun katuk.</w:t>
-      </w:r>
-    </w:p>
-    <w:p>
-      <w:pPr>
-        <w:pStyle w:val="StyleIsiParagraf"/>
-      </w:pPr>
-      <w:r>
-        <w:t>2. Mengidentifikasi pemberian ASI eksklusif pada ibu nifas.</w:t>
-      </w:r>
-    </w:p>
-    <w:p>
-      <w:pPr>
-        <w:pStyle w:val="StyleIsiParagraf"/>
-      </w:pPr>
+      <w:bookmarkStart w:id="18" w:name="_Toc121754039"/>
+      <w:bookmarkEnd w:id="18"/>
       <w:r>
         <w:t>3. Menganalisis hubungan antara pengetahuan ibu nifas tentang manfaat daun katuk dengan pemberian ASI eksklusif.</w:t>
       </w:r>
@@ -11136,10 +11144,9 @@
       <w:pPr>
         <w:pStyle w:val="StyleIsiParagraf"/>
       </w:pPr>
-      <w:r>
-        <w:rPr>
-          <w:b w:val="0"/>
-        </w:rPr>
+      <w:bookmarkStart w:id="18" w:name="_Toc121754039"/>
+      <w:bookmarkEnd w:id="18"/>
+      <w:r>
         <w:t>Masa nifas (puerperium) adalah masa sejak satu jam setelah plasenta lahir sampai enam minggu (42 hari) setelah persalinan, seiring pulihnya alat reproduksi ibu ke keadaan sebelum hamil. Pada masa ini terjadi involusi rahim, pengeluaran lokia, serta penyesuaian hormonal dan psikologis ibu terhadap perannya. Masa nifas juga merupakan masa penentuan keberhasilan menyusui karena produksi ASI bekerja berdasarkan permintaan: semakin sering bayi menyusu, semakin banyak hormon prolaktin dilepaskan sehingga produksi ASI meningkat. Karena itu, asupan gizi, istirahat, kepercayaan diri, dan pengetahuan ibu nifas sangat menentukan kelancaran pemberian ASI.</w:t>
       </w:r>
     </w:p>
@@ -11155,10 +11162,9 @@
       <w:pPr>
         <w:pStyle w:val="StyleIsiParagraf"/>
       </w:pPr>
-      <w:r>
-        <w:rPr>
-          <w:b w:val="0"/>
-        </w:rPr>
+      <w:bookmarkStart w:id="18" w:name="_Toc121754039"/>
+      <w:bookmarkEnd w:id="18"/>
+      <w:r>
         <w:t>Pengetahuan merupakan hasil dari tahu, yang terjadi setelah orang melakukan penginderaan terhadap suatu objek tertentu (Notoatmodjo, 2012). Pengetahuan memiliki enam tingkatan, yaitu tahu, memahami, aplikasi, analisis, sintesis, dan evaluasi. Faktor yang memengaruhi pengetahuan antara lain tingkat pendidikan, informasi yang diperoleh, pengalaman, usia, dan lingkungan sosial. Pengetahuan merupakan domain yang sangat penting untuk terbentuknya perilaku; perilaku yang didasari pengetahuan yang baik akan lebih bertahan lama dibandingkan perilaku yang hanya mengikuti kebiasaan.</w:t>
       </w:r>
     </w:p>
@@ -11174,11 +11180,10 @@
       <w:pPr>
         <w:pStyle w:val="StyleIsiParagraf"/>
       </w:pPr>
-      <w:r>
-        <w:rPr>
-          <w:b w:val="0"/>
-        </w:rPr>
-        <w:t>Daun katuk (Sauropus androgynus (L.) Merr.) adalah tanaman yang banyak tumbuh di Indonesia dan secara tradisional digunakan untuk melancarkan produksi ASI (Hayati dkk., 2016). Daun katuk mengandung protein, karoten, vitamin, serta senyawa aktif seperti fitosterol dan alkaloid yang diduga merangsang pengeluaran hormon prolaktin sehingga produksi ASI meningkat (Santoso, 2013). Beberapa penelitian membuktikan manfaat tersebut: Rahmanisa (2016) menemukan efektivitas ekstrak alkaloid dan sterol daun katuk terhadap produksi ASI, Situmorang (2019) menemukan konsumsi air rebusan daun katuk meningkatkan pengeluaran ASI pada ibu nifas, dan Dolang dkk. (2021) menemukan pemberian rebusan daun katuk berpengaruh terhadap produksi ASI pada ibu nifas (p = 0,000).</w:t>
+      <w:bookmarkStart w:id="18" w:name="_Toc121754039"/>
+      <w:bookmarkEnd w:id="18"/>
+      <w:r>
+        <w:t>Daun katuk (Sauropus androgynus (L.) Merr.) adalah tanaman yang banyak tumbuh di Indonesia dan secara tradisional digunakan untuk melancarkan produksi ASI (Hayati dkk., 2016). Daun katuk mengandung protein, karoten, vitamin, serta senyawa aktif seperti fitosterol dan alkaloid yang diduga merangsang pengeluaran hormon prolaktin sehingga produksi ASI meningkat (Santoso, 2013). Beberapa penelitian membuktikan manfaat tersebut: Rahmanisa (2016) menemukan efektivitas ekstrak alkaloid dan sterol daun katuk terhadap produksi ASI, Situmorang (2019) menemukan konsumsi air rebusan daun katuk meningkatkan pengeluaran ASI pada ibu nifas, Asnidawati (2021) menemukan efektivitas pemberian daun katuk terhadap peningkatan produksi ASI, dan Dolang dkk. (2021) menemukan pemberian rebusan daun katuk berpengaruh terhadap produksi ASI pada ibu nifas (p = 0,000).</w:t>
       </w:r>
     </w:p>
     <w:p>
@@ -11193,10 +11198,9 @@
       <w:pPr>
         <w:pStyle w:val="StyleIsiParagraf"/>
       </w:pPr>
-      <w:r>
-        <w:rPr>
-          <w:b w:val="0"/>
-        </w:rPr>
+      <w:bookmarkStart w:id="18" w:name="_Toc121754039"/>
+      <w:bookmarkEnd w:id="18"/>
+      <w:r>
         <w:t>Kerangka konsep penelitian ini menggambarkan hubungan antara variabel yang diteliti. Variabel bebas dalam penelitian ini adalah pengetahuan ibu nifas tentang manfaat daun katuk, sedangkan variabel terikat adalah pemberian ASI eksklusif. Pengetahuan ibu nifas tentang manfaat daun katuk diduga berhubungan dengan pemberian ASI eksklusif: ibu yang memahami manfaat daun katuk bagi produksi ASI akan memanfaatkan daun katuk sebagai pendukung laktasi dan lebih termotivasi memberikan ASI secara eksklusif.</w:t>
       </w:r>
     </w:p>
@@ -11212,10 +11216,9 @@
       <w:pPr>
         <w:pStyle w:val="StyleIsiParagraf"/>
       </w:pPr>
-      <w:r>
-        <w:rPr>
-          <w:b w:val="0"/>
-        </w:rPr>
+      <w:bookmarkStart w:id="18" w:name="_Toc121754039"/>
+      <w:bookmarkEnd w:id="18"/>
+      <w:r>
         <w:t>Berdasarkan kerangka konsep tersebut, hipotesis penelitian ini adalah: Ha: ada hubungan antara pengetahuan ibu nifas tentang manfaat daun katuk dengan pemberian ASI eksklusif. H0: tidak ada hubungan antara pengetahuan ibu nifas tentang manfaat daun katuk dengan pemberian ASI eksklusif.</w:t>
       </w:r>
     </w:p>
@@ -11478,7 +11481,7 @@
                 <w:rFonts w:ascii="Times New Roman" w:hAnsi="Times New Roman"/>
                 <w:sz w:val="20"/>
               </w:rPr>
-              <w:t>Pengaruh Konsumsi Air Rebusan Daun Katuk terhadap Pengeluaran Produksi ASI pada Ibu Nifas di BPM Manurung Medan. Situmorang (2019)</w:t>
+              <w:t>Efektivitas Pemberian Daun Katuk terhadap Peningkatan Produksi ASI. Asnidawati (2021)</w:t>
             </w:r>
           </w:p>
         </w:tc>
@@ -11506,7 +11509,7 @@
                 <w:rFonts w:ascii="Times New Roman" w:hAnsi="Times New Roman"/>
                 <w:sz w:val="20"/>
               </w:rPr>
-              <w:t>Konsumsi air rebusan daun katuk dan pengeluaran ASI</w:t>
+              <w:t>Pemberian daun katuk dan peningkatan produksi ASI</w:t>
             </w:r>
           </w:p>
         </w:tc>
@@ -11520,7 +11523,7 @@
                 <w:rFonts w:ascii="Times New Roman" w:hAnsi="Times New Roman"/>
                 <w:sz w:val="20"/>
               </w:rPr>
-              <w:t>Konsumsi air rebusan daun katuk meningkatkan pengeluaran produksi ASI pada ibu nifas.</w:t>
+              <w:t>Pemberian daun katuk efektif meningkatkan produksi ASI pada ibu menyusui.</w:t>
             </w:r>
           </w:p>
         </w:tc>
@@ -11550,7 +11553,7 @@
                 <w:rFonts w:ascii="Times New Roman" w:hAnsi="Times New Roman"/>
                 <w:sz w:val="20"/>
               </w:rPr>
-              <w:t>Efektivitas Daun Katuk (Sauropus androgynus) terhadap Kecukupan ASI pada Ibu Menyusui. Juliastuti (2019)</w:t>
+              <w:t>Pengaruh Konsumsi Air Rebusan Daun Katuk terhadap Pengeluaran Produksi ASI pada Ibu Nifas di BPM Manurung Medan. Situmorang (2019)</w:t>
             </w:r>
           </w:p>
         </w:tc>
@@ -11564,7 +11567,7 @@
                 <w:rFonts w:ascii="Times New Roman" w:hAnsi="Times New Roman"/>
                 <w:sz w:val="20"/>
               </w:rPr>
-              <w:t>Survei analitik</w:t>
+              <w:t>Pra-eksperimen</w:t>
             </w:r>
           </w:p>
         </w:tc>
@@ -11578,7 +11581,7 @@
                 <w:rFonts w:ascii="Times New Roman" w:hAnsi="Times New Roman"/>
                 <w:sz w:val="20"/>
               </w:rPr>
-              <w:t>Pemberian daun katuk dan kecukupan ASI</w:t>
+              <w:t>Konsumsi air rebusan daun katuk dan pengeluaran ASI</w:t>
             </w:r>
           </w:p>
         </w:tc>
@@ -11592,7 +11595,7 @@
                 <w:rFonts w:ascii="Times New Roman" w:hAnsi="Times New Roman"/>
                 <w:sz w:val="20"/>
               </w:rPr>
-              <w:t>Daun katuk efektif terhadap kecukupan ASI pada ibu menyusui di wilayah kerja Puskesmas Kuta Baro.</w:t>
+              <w:t>Konsumsi air rebusan daun katuk meningkatkan pengeluaran produksi ASI pada ibu nifas.</w:t>
             </w:r>
           </w:p>
         </w:tc>
@@ -11766,7 +11769,7 @@
         </w:sectPr>
       </w:pPr>
       <w:r>
-        <w:t>Kebaruan penelitian ini terletak pada variabel dan fokus kajiannya. Penelitian terdahulu umumnya menguji pengaruh pemberian daun katuk terhadap produksi ASI secara eksperimen, atau hubungan pengetahuan umum tentang ASI dengan praktik menyusui. Penelitian ini secara spesifik menguji hubungan antara pengetahuan ibu nifas tentang manfaat daun katuk (variabel bebas) dengan pemberian ASI eksklusif (variabel terikat) menggunakan pendekatan kuantitatif korelasional, sehingga dapat menjawab apkaah pengetahuan tentang tanaman laktogogum lokal tersebut berhubungan dengan keberhasilan ASI eksklusif.</w:t>
+        <w:t>Kebaruan penelitian ini terletak pada variabel dan fokus kajiannya. Penelitian terdahulu umumnya menguji pengaruh pemberian daun katuk terhadap produksi ASI secara eksperimen, atau hubungan pengetahuan umum tentang ASI dengan praktik menyusui. Penelitian ini secara spesifik menguji hubungan antara pengetahuan ibu nifas tentang manfaat daun katuk (variabel bebas) dengan pemberian ASI eksklusif (variabel terikat) menggunakan pendekatan kuantitatif korelasional, sehingga dapat menjawab apakah pengetahuan tentang tanaman laktogogum lokal tersebut berhubungan dengan keberhasilan ASI eksklusif.</w:t>
       </w:r>
     </w:p>
     <w:p>
@@ -11817,7 +11820,7 @@
         <w:pStyle w:val="StyleIsiParagraf"/>
       </w:pPr>
       <w:r>
-        <w:t>Penelitian dilaksanakan di ................ (petunjuk: tuliskan lokasi penelitian, misalnya wilayah kerja Puskesmas/BPM/RS) pada bulan ................ tahun 2026. Pemilihan lokasi dan waktu disesuaikan dengan izin dari institusi dan tempat pelayanan yang dituju.</w:t>
+        <w:t>Penelitian dilaksanakan di ................ (petunjuk: tuliskan lokasi penelitian, misalnya wilayah kerja Puskesmas/BPM/RS di wilayah Bima) pada bulan ................ tahun 2026. Pemilihan lokasi dan waktu disesuaikan dengan izin dari institusi dan tempat pelayanan yang dituju.</w:t>
       </w:r>
     </w:p>
     <w:p>
@@ -11835,7 +11838,7 @@
         <w:pStyle w:val="StyleIsiParagraf"/>
       </w:pPr>
       <w:r>
-        <w:t>Populasi dalam penelitian ini adalah seluruh ibu nifas yang memenuhi kriteria di lokasi penelitian. Sampel diambil dengan teknik ................ (petunjuk: pilih teknik sampling, misalnya total sampling bila populasi kecil, atau purposive/accidental sampling) dengan kriteria inklusi ibu nifas hari ke-0 sampai ke-42 yang bersedia menjadi responden dan kriteria eksklusi ibu dengan kondisi medis yang menghalangkan pemberian ASI. Jumlah sampel minimal dihitung menggunakan rumus ................ (petunjuk: lampirkan rumus sampel yang digunakan).</w:t>
+        <w:t>Populasi dalam penelitian ini adalah seluruh ibu nifas yang memenuhi kriteria di lokasi penelitian. Sampel diambil dengan teknik ................ (petunjuk: pilih teknik sampling, misalnya total sampling bila populasi kecil, atau purposive/accidental sampling) dengan kriteria inklusi ibu nifas hari ke-0 sampai ke-42 yang bersedia menjadi responden dan kriteria eksklusi ibu dengan kondisi medis yang menghalalkan pemberian ASI. Jumlah sampel minimal dihitung menggunakan rumus ................ (petunjuk: lampirkan rumus sampel yang digunakan).</w:t>
       </w:r>
     </w:p>
     <w:p>
@@ -11907,7 +11910,7 @@
         <w:pStyle w:val="StyleIsiParagraf"/>
       </w:pPr>
       <w:r>
-        <w:t>HASIL PENELITIAN DAN PEMBAHASAN</w:t>
+        <w:t>Analisis data dilakukan secara bertahap. Analisis univariat untuk mendeskripsikan karakteristik responden serta distribusi tingkat pengetahuan dan pemberian ASI eksklusif dalam bentuk distribusi frekuensi. Analisis bivariat untuk menguji hipotesis menggunakan uji chi-square dengan tingkat kemaknaan α = 0,05; bila nilai p &lt; 0,05 maka Ha diterima, artinya ada hubungan bermakna antara pengetahuan ibu nifas tentang manfaat daun katuk dengan pemberian ASI eksklusif.</w:t>
       </w:r>
     </w:p>
     <w:p>
@@ -11915,7 +11918,7 @@
         <w:pStyle w:val="StyleIsiParagraf"/>
       </w:pPr>
       <w:r>
-        <w:t>Gambaran Umum Responden</w:t>
+        <w:t>Apabila tidak memenuhi syarat uji chi-square, analisis dilanjutkan dengan uji alternatif yang sesuai (petunjuk: tentukan uji alternatif yang digunakan, misalnya uji eksak Fisher).</w:t>
       </w:r>
     </w:p>
     <w:p>
@@ -11923,7 +11926,17 @@
         <w:pStyle w:val="Judul2"/>
       </w:pPr>
       <w:r>
-        <w:t>Bab ini menyajikan hasil penelitian yang telah dilaksanakan di ................ (petunjuk: tuliskan tempat dan waktu pelaksanaan) terhadap .... responden ibu nifas yang memenuhi kriteria penelitian. (Petunjuk: uraikan secara ringkas karakteristik responden, misalnya usia, pendidikan, pekerjaan, dan paritas, beserta tabel distribusinya bila diperlukan.)</w:t>
+        <w:t>Etika Penelitian</w:t>
+      </w:r>
+    </w:p>
+    <w:p>
+      <w:pPr>
+        <w:pStyle w:val="StyleIsiParagraf"/>
+      </w:pPr>
+      <w:bookmarkStart w:id="18" w:name="_Toc121754039"/>
+      <w:bookmarkEnd w:id="18"/>
+      <w:r>
+        <w:t>Penelitian ini menerapkan prinsip etika penelitian, yaitu menghormati hak responden melalui penjelasan tujuan penelitian dan persetujuan setelah penjelasan (informed consent), menjaga kerahasiaan identitas responden (anonimitas dan kerahasiaan), serta tidak menimbulkan kerugian bagi responden. Data hanya digunakan untuk kepentingan penelitian.</w:t>
       </w:r>
     </w:p>
     <w:p>
@@ -11937,7 +11950,7 @@
         </w:sectPr>
       </w:pPr>
       <w:r>
-        <w:t>Analisis Univariat</w:t>
+        <w:br/>
       </w:r>
     </w:p>
     <w:p>
@@ -11951,266 +11964,19 @@
           <w:docGrid w:linePitch="360"/>
         </w:sectPr>
       </w:pPr>
-      <w:r>
-        <w:t>Analisis univariat bertujuan mendeskripsikan masing-masing variabel dalam bentuk distribusi frekuensi dan persentase. Hasil analisis tingkat pengetahuan ibu nifas tentang manfaat daun katuk disajikan pada Tabel 4.1 berikut. (Petunjuk: isi tabel setelah data terkumpul; sajikan juga distribusi pemberian ASI eksklusif dengan tabel serupa.)</w:t>
-      </w:r>
-    </w:p>
-    <w:p>
-      <w:pPr>
-        <w:pStyle w:val="StyleGambar"/>
-        <w:sectPr>
-          <w:type w:val="continuous"/>
-          <w:pgSz w:w="11907" w:h="16840" w:code="9"/>
-          <w:pgMar w:top="1701" w:right="1701" w:bottom="1701" w:left="2268" w:header="708" w:footer="708" w:gutter="0"/>
-          <w:cols w:space="708"/>
-          <w:docGrid w:linePitch="360"/>
-        </w:sectPr>
-      </w:pPr>
-      <w:r>
-        <w:t>Tabel 4.1 Distribusi Tingkat Pengetahuan Ibu Nifas tentang Manfaat Daun Katuk</w:t>
-      </w:r>
-    </w:p>
-    <w:tbl>
-      <w:tblPr>
-        <w:tblStyle w:val="KisiTabel"/>
-        <w:tblW w:type="auto" w:w="0"/>
-        <w:tblLook w:firstColumn="1" w:firstRow="1" w:lastColumn="0" w:lastRow="0" w:noHBand="0" w:noVBand="1" w:val="04A0"/>
-      </w:tblPr>
-      <w:tblGrid>
-        <w:gridCol w:w="2646"/>
-        <w:gridCol w:w="2646"/>
-        <w:gridCol w:w="2646"/>
-      </w:tblGrid>
-      <w:tr>
-        <w:tc>
-          <w:tcPr>
-            <w:tcW w:type="dxa" w:w="2646"/>
-          </w:tcPr>
-          <w:p>
-            <w:r>
-              <w:rPr>
-                <w:rFonts w:ascii="Times New Roman" w:hAnsi="Times New Roman"/>
-                <w:sz w:val="20"/>
-              </w:rPr>
-              <w:t>Tingkat Pengetahuan</w:t>
-            </w:r>
-          </w:p>
-        </w:tc>
-        <w:tc>
-          <w:tcPr>
-            <w:tcW w:type="dxa" w:w="2646"/>
-          </w:tcPr>
-          <w:p>
-            <w:r>
-              <w:rPr>
-                <w:rFonts w:ascii="Times New Roman" w:hAnsi="Times New Roman"/>
-                <w:sz w:val="20"/>
-              </w:rPr>
-              <w:t>Jumlah (f)</w:t>
-            </w:r>
-          </w:p>
-        </w:tc>
-        <w:tc>
-          <w:tcPr>
-            <w:tcW w:type="dxa" w:w="2646"/>
-          </w:tcPr>
-          <w:p>
-            <w:r>
-              <w:rPr>
-                <w:rFonts w:ascii="Times New Roman" w:hAnsi="Times New Roman"/>
-                <w:sz w:val="20"/>
-              </w:rPr>
-              <w:t>Persentase (%)</w:t>
-            </w:r>
-          </w:p>
-        </w:tc>
-      </w:tr>
-      <w:tr>
-        <w:tc>
-          <w:tcPr>
-            <w:tcW w:type="dxa" w:w="2646"/>
-          </w:tcPr>
-          <w:p>
-            <w:r>
-              <w:rPr>
-                <w:rFonts w:ascii="Times New Roman" w:hAnsi="Times New Roman"/>
-                <w:sz w:val="20"/>
-              </w:rPr>
-              <w:t>Baik</w:t>
-            </w:r>
-          </w:p>
-        </w:tc>
-        <w:tc>
-          <w:tcPr>
-            <w:tcW w:type="dxa" w:w="2646"/>
-          </w:tcPr>
-          <w:p>
-            <w:r>
-              <w:rPr>
-                <w:rFonts w:ascii="Times New Roman" w:hAnsi="Times New Roman"/>
-                <w:sz w:val="20"/>
-              </w:rPr>
-              <w:t>....</w:t>
-            </w:r>
-          </w:p>
-        </w:tc>
-        <w:tc>
-          <w:tcPr>
-            <w:tcW w:type="dxa" w:w="2646"/>
-          </w:tcPr>
-          <w:p>
-            <w:r>
-              <w:rPr>
-                <w:rFonts w:ascii="Times New Roman" w:hAnsi="Times New Roman"/>
-                <w:sz w:val="20"/>
-              </w:rPr>
-              <w:t>....</w:t>
-            </w:r>
-          </w:p>
-        </w:tc>
-      </w:tr>
-      <w:tr>
-        <w:tc>
-          <w:tcPr>
-            <w:tcW w:type="dxa" w:w="2646"/>
-          </w:tcPr>
-          <w:p>
-            <w:r>
-              <w:rPr>
-                <w:rFonts w:ascii="Times New Roman" w:hAnsi="Times New Roman"/>
-                <w:sz w:val="20"/>
-              </w:rPr>
-              <w:t>Cukup</w:t>
-            </w:r>
-          </w:p>
-        </w:tc>
-        <w:tc>
-          <w:tcPr>
-            <w:tcW w:type="dxa" w:w="2646"/>
-          </w:tcPr>
-          <w:p>
-            <w:r>
-              <w:rPr>
-                <w:rFonts w:ascii="Times New Roman" w:hAnsi="Times New Roman"/>
-                <w:sz w:val="20"/>
-              </w:rPr>
-              <w:t>....</w:t>
-            </w:r>
-          </w:p>
-        </w:tc>
-        <w:tc>
-          <w:tcPr>
-            <w:tcW w:type="dxa" w:w="2646"/>
-          </w:tcPr>
-          <w:p>
-            <w:r>
-              <w:rPr>
-                <w:rFonts w:ascii="Times New Roman" w:hAnsi="Times New Roman"/>
-                <w:sz w:val="20"/>
-              </w:rPr>
-              <w:t>....</w:t>
-            </w:r>
-          </w:p>
-        </w:tc>
-      </w:tr>
-      <w:tr>
-        <w:tc>
-          <w:tcPr>
-            <w:tcW w:type="dxa" w:w="2646"/>
-          </w:tcPr>
-          <w:p>
-            <w:r>
-              <w:rPr>
-                <w:rFonts w:ascii="Times New Roman" w:hAnsi="Times New Roman"/>
-                <w:sz w:val="20"/>
-              </w:rPr>
-              <w:t>Kurang</w:t>
-            </w:r>
-          </w:p>
-        </w:tc>
-        <w:tc>
-          <w:tcPr>
-            <w:tcW w:type="dxa" w:w="2646"/>
-          </w:tcPr>
-          <w:p>
-            <w:r>
-              <w:rPr>
-                <w:rFonts w:ascii="Times New Roman" w:hAnsi="Times New Roman"/>
-                <w:sz w:val="20"/>
-              </w:rPr>
-              <w:t>....</w:t>
-            </w:r>
-          </w:p>
-        </w:tc>
-        <w:tc>
-          <w:tcPr>
-            <w:tcW w:type="dxa" w:w="2646"/>
-          </w:tcPr>
-          <w:p>
-            <w:r>
-              <w:rPr>
-                <w:rFonts w:ascii="Times New Roman" w:hAnsi="Times New Roman"/>
-                <w:sz w:val="20"/>
-              </w:rPr>
-              <w:t>....</w:t>
-            </w:r>
-          </w:p>
-        </w:tc>
-      </w:tr>
-      <w:tr>
-        <w:tc>
-          <w:tcPr>
-            <w:tcW w:type="dxa" w:w="2646"/>
-          </w:tcPr>
-          <w:p>
-            <w:r>
-              <w:rPr>
-                <w:rFonts w:ascii="Times New Roman" w:hAnsi="Times New Roman"/>
-                <w:sz w:val="20"/>
-              </w:rPr>
-              <w:t>Jumlah</w:t>
-            </w:r>
-          </w:p>
-        </w:tc>
-        <w:tc>
-          <w:tcPr>
-            <w:tcW w:type="dxa" w:w="2646"/>
-          </w:tcPr>
-          <w:p>
-            <w:r>
-              <w:rPr>
-                <w:rFonts w:ascii="Times New Roman" w:hAnsi="Times New Roman"/>
-                <w:sz w:val="20"/>
-              </w:rPr>
-              <w:t>....</w:t>
-            </w:r>
-          </w:p>
-        </w:tc>
-        <w:tc>
-          <w:tcPr>
-            <w:tcW w:type="dxa" w:w="2646"/>
-          </w:tcPr>
-          <w:p>
-            <w:r>
-              <w:rPr>
-                <w:rFonts w:ascii="Times New Roman" w:hAnsi="Times New Roman"/>
-                <w:sz w:val="20"/>
-              </w:rPr>
-              <w:t>100</w:t>
-            </w:r>
-          </w:p>
-        </w:tc>
-      </w:tr>
-    </w:tbl>
+    </w:p>
     <w:p>
       <w:pPr>
         <w:pStyle w:val="Judul1"/>
       </w:pPr>
+      <w:r>
+        <w:br/>
+      </w:r>
       <w:bookmarkStart w:id="39" w:name="_Toc121754055"/>
+      <w:r>
+        <w:t>ANALISIS DAN PEMBAHASAN</w:t>
+      </w:r>
       <w:bookmarkEnd w:id="39"/>
-      <w:r>
-        <w:t>Analisis Bivariat</w:t>
-      </w:r>
     </w:p>
     <w:p>
       <w:pPr>
@@ -12218,331 +11984,17 @@
         <w:spacing w:after="160"/>
       </w:pPr>
       <w:bookmarkStart w:id="40" w:name="_Toc121754056"/>
+      <w:r>
+        <w:t>Analisis</w:t>
+      </w:r>
       <w:bookmarkEnd w:id="40"/>
-      <w:r>
-        <w:t>Analisis bivariat dilakukan untuk menguji hipotesis penelitian menggunakan uji chi-square dengan tingkat kemaknaan α = 0,05. Tabulasi silang antara pengetahuan ibu nifas tentang manfaat daun katuk dengan pemberian ASI eksklusif disajikan pada Tabel 4.2 berikut. (Petunjuk: isi tabel setelah data terkumpul, lalu laporkan nilai p-value dan keputusan hipotesis, misalnya "p = 0,002 &lt; 0,05 sehingga Ha diterima".)</w:t>
-      </w:r>
-    </w:p>
-    <w:p>
-      <w:pPr>
-        <w:pStyle w:val="StyleGambar"/>
-        <w:spacing w:after="160"/>
-      </w:pPr>
-      <w:bookmarkStart w:id="40" w:name="_Toc121754056"/>
-      <w:bookmarkEnd w:id="40"/>
-      <w:r>
-        <w:t>Tabel 4.2 Tabulasi Silang Pengetahuan dengan Pemberian ASI Eksklusif</w:t>
-      </w:r>
-    </w:p>
-    <w:tbl>
-      <w:tblPr>
-        <w:tblStyle w:val="KisiTabel"/>
-        <w:tblW w:type="auto" w:w="0"/>
-        <w:tblLook w:firstColumn="1" w:firstRow="1" w:lastColumn="0" w:lastRow="0" w:noHBand="0" w:noVBand="1" w:val="04A0"/>
-      </w:tblPr>
-      <w:tblGrid>
-        <w:gridCol w:w="1984"/>
-        <w:gridCol w:w="1984"/>
-        <w:gridCol w:w="1984"/>
-        <w:gridCol w:w="1984"/>
-      </w:tblGrid>
-      <w:tr>
-        <w:tc>
-          <w:tcPr>
-            <w:tcW w:type="dxa" w:w="1984"/>
-          </w:tcPr>
-          <w:p>
-            <w:r>
-              <w:rPr>
-                <w:rFonts w:ascii="Times New Roman" w:hAnsi="Times New Roman"/>
-                <w:sz w:val="20"/>
-              </w:rPr>
-              <w:t>Tingkat Pengetahuan</w:t>
-            </w:r>
-          </w:p>
-        </w:tc>
-        <w:tc>
-          <w:tcPr>
-            <w:tcW w:type="dxa" w:w="1984"/>
-          </w:tcPr>
-          <w:p>
-            <w:r>
-              <w:rPr>
-                <w:rFonts w:ascii="Times New Roman" w:hAnsi="Times New Roman"/>
-                <w:sz w:val="20"/>
-              </w:rPr>
-              <w:t>ASI Eksklusif (Ya)</w:t>
-            </w:r>
-          </w:p>
-        </w:tc>
-        <w:tc>
-          <w:tcPr>
-            <w:tcW w:type="dxa" w:w="1984"/>
-          </w:tcPr>
-          <w:p>
-            <w:r>
-              <w:rPr>
-                <w:rFonts w:ascii="Times New Roman" w:hAnsi="Times New Roman"/>
-                <w:sz w:val="20"/>
-              </w:rPr>
-              <w:t>ASI Eksklusif (Tidak)</w:t>
-            </w:r>
-          </w:p>
-        </w:tc>
-        <w:tc>
-          <w:tcPr>
-            <w:tcW w:type="dxa" w:w="1984"/>
-          </w:tcPr>
-          <w:p>
-            <w:r>
-              <w:rPr>
-                <w:rFonts w:ascii="Times New Roman" w:hAnsi="Times New Roman"/>
-                <w:sz w:val="20"/>
-              </w:rPr>
-              <w:t>Jumlah</w:t>
-            </w:r>
-          </w:p>
-        </w:tc>
-      </w:tr>
-      <w:tr>
-        <w:tc>
-          <w:tcPr>
-            <w:tcW w:type="dxa" w:w="1984"/>
-          </w:tcPr>
-          <w:p>
-            <w:r>
-              <w:rPr>
-                <w:rFonts w:ascii="Times New Roman" w:hAnsi="Times New Roman"/>
-                <w:sz w:val="20"/>
-              </w:rPr>
-              <w:t>Baik</w:t>
-            </w:r>
-          </w:p>
-        </w:tc>
-        <w:tc>
-          <w:tcPr>
-            <w:tcW w:type="dxa" w:w="1984"/>
-          </w:tcPr>
-          <w:p>
-            <w:r>
-              <w:rPr>
-                <w:rFonts w:ascii="Times New Roman" w:hAnsi="Times New Roman"/>
-                <w:sz w:val="20"/>
-              </w:rPr>
-              <w:t>....</w:t>
-            </w:r>
-          </w:p>
-        </w:tc>
-        <w:tc>
-          <w:tcPr>
-            <w:tcW w:type="dxa" w:w="1984"/>
-          </w:tcPr>
-          <w:p>
-            <w:r>
-              <w:rPr>
-                <w:rFonts w:ascii="Times New Roman" w:hAnsi="Times New Roman"/>
-                <w:sz w:val="20"/>
-              </w:rPr>
-              <w:t>....</w:t>
-            </w:r>
-          </w:p>
-        </w:tc>
-        <w:tc>
-          <w:tcPr>
-            <w:tcW w:type="dxa" w:w="1984"/>
-          </w:tcPr>
-          <w:p>
-            <w:r>
-              <w:rPr>
-                <w:rFonts w:ascii="Times New Roman" w:hAnsi="Times New Roman"/>
-                <w:sz w:val="20"/>
-              </w:rPr>
-              <w:t>....</w:t>
-            </w:r>
-          </w:p>
-        </w:tc>
-      </w:tr>
-      <w:tr>
-        <w:tc>
-          <w:tcPr>
-            <w:tcW w:type="dxa" w:w="1984"/>
-          </w:tcPr>
-          <w:p>
-            <w:r>
-              <w:rPr>
-                <w:rFonts w:ascii="Times New Roman" w:hAnsi="Times New Roman"/>
-                <w:sz w:val="20"/>
-              </w:rPr>
-              <w:t>Cukup</w:t>
-            </w:r>
-          </w:p>
-        </w:tc>
-        <w:tc>
-          <w:tcPr>
-            <w:tcW w:type="dxa" w:w="1984"/>
-          </w:tcPr>
-          <w:p>
-            <w:r>
-              <w:rPr>
-                <w:rFonts w:ascii="Times New Roman" w:hAnsi="Times New Roman"/>
-                <w:sz w:val="20"/>
-              </w:rPr>
-              <w:t>....</w:t>
-            </w:r>
-          </w:p>
-        </w:tc>
-        <w:tc>
-          <w:tcPr>
-            <w:tcW w:type="dxa" w:w="1984"/>
-          </w:tcPr>
-          <w:p>
-            <w:r>
-              <w:rPr>
-                <w:rFonts w:ascii="Times New Roman" w:hAnsi="Times New Roman"/>
-                <w:sz w:val="20"/>
-              </w:rPr>
-              <w:t>....</w:t>
-            </w:r>
-          </w:p>
-        </w:tc>
-        <w:tc>
-          <w:tcPr>
-            <w:tcW w:type="dxa" w:w="1984"/>
-          </w:tcPr>
-          <w:p>
-            <w:r>
-              <w:rPr>
-                <w:rFonts w:ascii="Times New Roman" w:hAnsi="Times New Roman"/>
-                <w:sz w:val="20"/>
-              </w:rPr>
-              <w:t>....</w:t>
-            </w:r>
-          </w:p>
-        </w:tc>
-      </w:tr>
-      <w:tr>
-        <w:tc>
-          <w:tcPr>
-            <w:tcW w:type="dxa" w:w="1984"/>
-          </w:tcPr>
-          <w:p>
-            <w:r>
-              <w:rPr>
-                <w:rFonts w:ascii="Times New Roman" w:hAnsi="Times New Roman"/>
-                <w:sz w:val="20"/>
-              </w:rPr>
-              <w:t>Kurang</w:t>
-            </w:r>
-          </w:p>
-        </w:tc>
-        <w:tc>
-          <w:tcPr>
-            <w:tcW w:type="dxa" w:w="1984"/>
-          </w:tcPr>
-          <w:p>
-            <w:r>
-              <w:rPr>
-                <w:rFonts w:ascii="Times New Roman" w:hAnsi="Times New Roman"/>
-                <w:sz w:val="20"/>
-              </w:rPr>
-              <w:t>....</w:t>
-            </w:r>
-          </w:p>
-        </w:tc>
-        <w:tc>
-          <w:tcPr>
-            <w:tcW w:type="dxa" w:w="1984"/>
-          </w:tcPr>
-          <w:p>
-            <w:r>
-              <w:rPr>
-                <w:rFonts w:ascii="Times New Roman" w:hAnsi="Times New Roman"/>
-                <w:sz w:val="20"/>
-              </w:rPr>
-              <w:t>....</w:t>
-            </w:r>
-          </w:p>
-        </w:tc>
-        <w:tc>
-          <w:tcPr>
-            <w:tcW w:type="dxa" w:w="1984"/>
-          </w:tcPr>
-          <w:p>
-            <w:r>
-              <w:rPr>
-                <w:rFonts w:ascii="Times New Roman" w:hAnsi="Times New Roman"/>
-                <w:sz w:val="20"/>
-              </w:rPr>
-              <w:t>....</w:t>
-            </w:r>
-          </w:p>
-        </w:tc>
-      </w:tr>
-      <w:tr>
-        <w:tc>
-          <w:tcPr>
-            <w:tcW w:type="dxa" w:w="1984"/>
-          </w:tcPr>
-          <w:p>
-            <w:r>
-              <w:rPr>
-                <w:rFonts w:ascii="Times New Roman" w:hAnsi="Times New Roman"/>
-                <w:sz w:val="20"/>
-              </w:rPr>
-              <w:t>Jumlah</w:t>
-            </w:r>
-          </w:p>
-        </w:tc>
-        <w:tc>
-          <w:tcPr>
-            <w:tcW w:type="dxa" w:w="1984"/>
-          </w:tcPr>
-          <w:p>
-            <w:r>
-              <w:rPr>
-                <w:rFonts w:ascii="Times New Roman" w:hAnsi="Times New Roman"/>
-                <w:sz w:val="20"/>
-              </w:rPr>
-              <w:t>....</w:t>
-            </w:r>
-          </w:p>
-        </w:tc>
-        <w:tc>
-          <w:tcPr>
-            <w:tcW w:type="dxa" w:w="1984"/>
-          </w:tcPr>
-          <w:p>
-            <w:r>
-              <w:rPr>
-                <w:rFonts w:ascii="Times New Roman" w:hAnsi="Times New Roman"/>
-                <w:sz w:val="20"/>
-              </w:rPr>
-              <w:t>....</w:t>
-            </w:r>
-          </w:p>
-        </w:tc>
-        <w:tc>
-          <w:tcPr>
-            <w:tcW w:type="dxa" w:w="1984"/>
-          </w:tcPr>
-          <w:p>
-            <w:r>
-              <w:rPr>
-                <w:rFonts w:ascii="Times New Roman" w:hAnsi="Times New Roman"/>
-                <w:sz w:val="20"/>
-              </w:rPr>
-              <w:t>....</w:t>
-            </w:r>
-          </w:p>
-        </w:tc>
-      </w:tr>
-    </w:tbl>
+    </w:p>
     <w:p>
       <w:pPr>
         <w:pStyle w:val="StyleIsiParagraf"/>
       </w:pPr>
       <w:r>
-        <w:t>Pembahasan</w:t>
+        <w:t>Pada bagian ini dipaparkan pembuatan atau implementasi sistem yang dibangun, percobaan atau pengujian yang dilakukan, analisis dari pengujian yang dilakukan dan dibahas secara detail dalam bentuk kualitatif, kuantitatif atau statistik terhadap hasil yang dicapai dalam pengujian.</w:t>
       </w:r>
     </w:p>
     <w:p>
@@ -12550,7 +12002,7 @@
         <w:pStyle w:val="StyleIsiParagraf"/>
       </w:pPr>
       <w:r>
-        <w:t>(Petunjuk: bahas temuan penelitian dengan mengaitkan hasil analisis bivariat dengan hipotesis yang diajukan pada BAB II. Bandingkan temuan dengan penelitian terdahulu, misalnya Pambudi (2022) tentang hubungan pengetahuan dengan pemberian ASI, serta Dolang dkk. (2021) dan Situmorang (2019) tentang manfaat daun katuk terhadap produksi ASI. Jelaskan pula keterkaitan temuan dengan teori pengetahuan Notoatmodjo (2012) dan keterbatasan penelitian.)</w:t>
+        <w:t>Hal-hal yang dipaparkan dalam bagian ini harus sesuai dengan metode yang dicantumkan pada bab metodologi penelitian. Pembahasan dari hasil pengujian yang dikaitkan dengan penelitian lain harus merujuk pada bab landasan teori. Apabila terdapat petunjuk penggunaan aplikasi, petunjuk tersebut tidak disertakan dalam bab ini, tetapi diletakkan pada bagian lampiran skripsi.</w:t>
       </w:r>
     </w:p>
     <w:p>
@@ -12733,7 +12185,7 @@
         </w:rPr>
       </w:pPr>
       <w:r>
-        <w:t>Dolang, M. W., Wattimena, F. P. A., Kiriwenno, E., Cahyawati, S., &amp; Sillehu, S. (2021). Pengaruh Pemberian Rebusan Daun Katuk terhadap Produksi ASI pada Ibu Nifas. JUMANTIK (Jurnal Ilmiah Penelitian Kesehatan), 6(3). https://doi.org/10.30829/jumantik.v6i3.9570</w:t>
+        <w:t>Asnidawati. (2021). Efektivitas Pemberian Daun Katuk terhadap Peningkatan Produksi ASI. Jurnal Antara Kebidanan, 4(4).</w:t>
       </w:r>
     </w:p>
     <w:p>
@@ -12746,7 +12198,7 @@
         </w:rPr>
       </w:pPr>
       <w:r>
-        <w:t>Hayati, A., Arumingtyas, E. L., Indriyani, S., &amp; Hakim, L. (2016). Local Knowledge of Katuk (Sauropus androgynus (L.) Merr) in East Java, Indonesia. International Journal of Current Pharmaceutical Review and Research, 7(4), 210-215.</w:t>
+        <w:t>Dolang, M. W., Wattimena, F. P. A., Kiriwenno, E., Cahyawati, S., &amp; Sillehu, S. (2021). Pengaruh Pemberian Rebusan Daun Katuk terhadap Produksi ASI pada Ibu Nifas. JUMANTIK (Jurnal Ilmiah Penelitian Kesehatan), 6(3). https://doi.org/10.30829/jumantik.v6i3.9570</w:t>
       </w:r>
     </w:p>
     <w:p>
@@ -12760,7 +12212,7 @@
         </w:rPr>
       </w:pPr>
       <w:r>
-        <w:t>Juliastuti, J. (2019). Efektivitas Daun Katuk (Sauropus androgynus) terhadap Kecukupan ASI pada Ibu Menyusui di Puskesmas Kuta Baro Aceh Besar. Indonesian Journal for Health Sciences, 3(1). https://doi.org/10.24269/ijhs.v3i1.1600</w:t>
+        <w:t>Hayati, A., Arumingtyas, E. L., Indriyani, S., &amp; Hakim, L. (2016). Local Knowledge of Katuk (Sauropus androgynus (L.) Merr) in East Java, Indonesia. International Journal of Current Pharmaceutical Review and Research, 7(4), 210-215.</w:t>
       </w:r>
     </w:p>
     <w:p>
@@ -12771,6 +12223,19 @@
           <w:color w:val="000000"/>
           <w:szCs w:val="24"/>
           <w:lang w:val="en-US"/>
+        </w:rPr>
+      </w:pPr>
+      <w:r>
+        <w:t>Juliastuti, J. (2019). Efektivitas Daun Katuk (Sauropus androgynus) terhadap Kecukupan ASI pada Ibu Menyusui di Puskesmas Kuta Baro Aceh Besar. Indonesian Journal for Health Sciences, 3(1). https://doi.org/10.24269/ijhs.v3i1.1600</w:t>
+      </w:r>
+    </w:p>
+    <w:p>
+      <w:pPr>
+        <w:spacing w:after="40" w:line="240" w:lineRule="auto"/>
+        <w:ind w:left="720" w:hanging="720"/>
+        <w:rPr>
+          <w:color w:val="000000"/>
+          <w:szCs w:val="24"/>
         </w:rPr>
       </w:pPr>
       <w:r>

</xml_diff>